<commit_message>
Update the Dynamic Analysis Instrument Element Procedure document (typo / added issue occlusion)
</commit_message>
<xml_diff>
--- a/source/reference_documents/tertiary_documents/implementation/Dynamic Analysis/instrument element/Dynamic Analysis - Instrument Element.docx
+++ b/source/reference_documents/tertiary_documents/implementation/Dynamic Analysis/instrument element/Dynamic Analysis - Instrument Element.docx
@@ -40,7 +40,7 @@
         <w:t xml:space="preserve">Version </w:t>
       </w:r>
       <w:r>
-        <w:t>2</w:t>
+        <w:t>3</w:t>
       </w:r>
     </w:p>
     <w:p>
@@ -57,7 +57,7 @@
         <w:rPr>
           <w:noProof/>
         </w:rPr>
-        <w:t>10/9/25 10:43 AM</w:t>
+        <w:t>10/31/25 10:04 AM</w:t>
       </w:r>
       <w:r>
         <w:fldChar w:fldCharType="end"/>
@@ -1187,14 +1187,7 @@
           <w:b/>
           <w:bCs/>
         </w:rPr>
-        <w:t>Establis</w:t>
-      </w:r>
-      <w:r>
-        <w:rPr>
-          <w:b/>
-          <w:bCs/>
-        </w:rPr>
-        <w:t>h</w:t>
+        <w:t>Establish</w:t>
       </w:r>
       <w:r>
         <w:t xml:space="preserve"> </w:t>
@@ -1240,10 +1233,7 @@
         <w:t xml:space="preserve"> will </w:t>
       </w:r>
       <w:r>
-        <w:t xml:space="preserve">take </w:t>
-      </w:r>
-      <w:r>
-        <w:t xml:space="preserve">the </w:t>
+        <w:t xml:space="preserve">take the </w:t>
       </w:r>
       <w:r>
         <w:rPr>
@@ -1410,7 +1400,7 @@
     </w:p>
     <w:p>
       <w:r>
-        <w:t>Since dynamic analysis is a run time activity typically utilized via a test suite, there are several things that need to be taken into consideration</w:t>
+        <w:t>Since dynamic analysis is a runtime activity typically utilized via a test suite, there are several things that need to be taken into consideration</w:t>
       </w:r>
       <w:r>
         <w:t>.</w:t>
@@ -1427,6 +1417,25 @@
     <w:p>
       <w:r>
         <w:t>Most dynamic analysis tools default to a termination-on-failure behavior. It is therefore important to adjust the test suite to take this into consideration.</w:t>
+      </w:r>
+    </w:p>
+    <w:p>
+      <w:pPr>
+        <w:pStyle w:val="Heading2"/>
+      </w:pPr>
+      <w:r>
+        <w:t>Issue Occlusion</w:t>
+      </w:r>
+    </w:p>
+    <w:p>
+      <w:r>
+        <w:t>Discovered issues may mask more fundamental ones</w:t>
+      </w:r>
+      <w:r>
+        <w:t>.</w:t>
+      </w:r>
+      <w:r>
+        <w:t xml:space="preserve"> Be sure to adjust the test to verify that the issue discovered it the root issue.</w:t>
       </w:r>
     </w:p>
     <w:p>

</xml_diff>

<commit_message>
added Dynamic Analysis Perform Analysis Procedure document / updated Dynamic Analysis Instrument Element Procedure (typo)
</commit_message>
<xml_diff>
--- a/source/reference_documents/tertiary_documents/implementation/Dynamic Analysis/instrument element/Dynamic Analysis - Instrument Element.docx
+++ b/source/reference_documents/tertiary_documents/implementation/Dynamic Analysis/instrument element/Dynamic Analysis - Instrument Element.docx
@@ -40,7 +40,7 @@
         <w:t xml:space="preserve">Version </w:t>
       </w:r>
       <w:r>
-        <w:t>3</w:t>
+        <w:t>4</w:t>
       </w:r>
     </w:p>
     <w:p>
@@ -57,7 +57,7 @@
         <w:rPr>
           <w:noProof/>
         </w:rPr>
-        <w:t>10/31/25 10:04 AM</w:t>
+        <w:t>10/31/25 1:12 PM</w:t>
       </w:r>
       <w:r>
         <w:fldChar w:fldCharType="end"/>
@@ -1429,13 +1429,13 @@
     </w:p>
     <w:p>
       <w:r>
-        <w:t>Discovered issues may mask more fundamental ones</w:t>
-      </w:r>
-      <w:r>
-        <w:t>.</w:t>
-      </w:r>
-      <w:r>
-        <w:t xml:space="preserve"> Be sure to adjust the test to verify that the issue discovered it the root issue.</w:t>
+        <w:t>Discovered issues may mask more fundamental ones. Be sure to adjust the test to verify that the issue discovered i</w:t>
+      </w:r>
+      <w:r>
+        <w:t>s</w:t>
+      </w:r>
+      <w:r>
+        <w:t xml:space="preserve"> the root issue.</w:t>
       </w:r>
     </w:p>
     <w:p>

</xml_diff>